<commit_message>
Execute all: thermal warping layer, public calculator, data-request pack, deck, PDF
(b) src/pavement/thermal.py — Bradbury warping, BUC/TDC dual mechanism check.
    Re-fitted Bradbury coefficient after catching a 0.308 deviation against a
    claimed +/-0.03; now 0.0226 max error, pinned by test.
    Finding: omitting warping understates stress ratio by ~43%.
    Wired into reliability.py via optional ThermalConfig.
(c) web/index.html — free offline browser calculator with full calculation trace;
    JS/Python parity verified to 3.4e-15 by tests/test_js_parity.py.
(a) docs/stage0/04_corridor_data_request.md — 4 routes incl. permission-free fallback.
(d) results/SETU_Supervisor_Deck.pptx — 11 slides, figures computed live.
(e) results/SETU_Research_Proposal.pdf — 12 pages, native ReportLab render.

Proposal .docx regenerated with live figures and new section 8.2.
56/56 tests passing.

Co-authored-by: arena-agent <297053741+arena-agent@users.noreply.github.com>
</commit_message>
<xml_diff>
--- a/results/SETU_Research_Proposal.docx
+++ b/results/SETU_Research_Proposal.docx
@@ -3494,6 +3494,118 @@
                 <w:b w:val="0"/>
                 <w:sz w:val="18"/>
               </w:rPr>
+              <w:t>Thermal warping module</w:t>
+            </w:r>
+          </w:p>
+        </w:tc>
+        <w:tc>
+          <w:tcPr>
+            <w:tcW w:type="dxa" w:w="4876"/>
+          </w:tcPr>
+          <w:p>
+            <w:pPr>
+              <w:spacing w:after="40"/>
+            </w:pPr>
+            <w:r/>
+            <w:r>
+              <w:rPr>
+                <w:b w:val="0"/>
+                <w:sz w:val="18"/>
+              </w:rPr>
+              <w:t>Bradbury coefficient by continuous fitted function; edge and interior warping stress; bottom-up (BUC) and top-down (TDC) cracking checks</w:t>
+            </w:r>
+          </w:p>
+        </w:tc>
+        <w:tc>
+          <w:tcPr>
+            <w:tcW w:type="dxa" w:w="1701"/>
+          </w:tcPr>
+          <w:p>
+            <w:pPr>
+              <w:spacing w:after="40"/>
+            </w:pPr>
+            <w:r/>
+            <w:r>
+              <w:rPr>
+                <w:b/>
+                <w:sz w:val="18"/>
+              </w:rPr>
+              <w:t>Implemented and verified</w:t>
+            </w:r>
+          </w:p>
+        </w:tc>
+      </w:tr>
+      <w:tr>
+        <w:tc>
+          <w:tcPr>
+            <w:tcW w:type="dxa" w:w="1928"/>
+          </w:tcPr>
+          <w:p>
+            <w:pPr>
+              <w:spacing w:after="40"/>
+            </w:pPr>
+            <w:r/>
+            <w:r>
+              <w:rPr>
+                <w:b w:val="0"/>
+                <w:sz w:val="18"/>
+              </w:rPr>
+              <w:t>Public computation tool</w:t>
+            </w:r>
+          </w:p>
+        </w:tc>
+        <w:tc>
+          <w:tcPr>
+            <w:tcW w:type="dxa" w:w="4876"/>
+          </w:tcPr>
+          <w:p>
+            <w:pPr>
+              <w:spacing w:after="40"/>
+            </w:pPr>
+            <w:r/>
+            <w:r>
+              <w:rPr>
+                <w:b w:val="0"/>
+                <w:sz w:val="18"/>
+              </w:rPr>
+              <w:t>Browser-based calculator with complete calculation trace, verified against the reference implementation to 3e-15</w:t>
+            </w:r>
+          </w:p>
+        </w:tc>
+        <w:tc>
+          <w:tcPr>
+            <w:tcW w:type="dxa" w:w="1701"/>
+          </w:tcPr>
+          <w:p>
+            <w:pPr>
+              <w:spacing w:after="40"/>
+            </w:pPr>
+            <w:r/>
+            <w:r>
+              <w:rPr>
+                <w:b/>
+                <w:sz w:val="18"/>
+              </w:rPr>
+              <w:t>Implemented and verified</w:t>
+            </w:r>
+          </w:p>
+        </w:tc>
+      </w:tr>
+      <w:tr>
+        <w:tc>
+          <w:tcPr>
+            <w:tcW w:type="dxa" w:w="1928"/>
+          </w:tcPr>
+          <w:p>
+            <w:pPr>
+              <w:spacing w:after="40"/>
+            </w:pPr>
+            <w:r/>
+            <w:r>
+              <w:rPr>
+                <w:b w:val="0"/>
+                <w:sz w:val="18"/>
+              </w:rPr>
               <w:t>Fatigue and damage module</w:t>
             </w:r>
           </w:p>
@@ -3624,7 +3736,7 @@
                 <w:b w:val="0"/>
                 <w:sz w:val="18"/>
               </w:rPr>
-              <w:t>31 automated tests encoding physical invariants and the reduction to the deterministic codal result</w:t>
+              <w:t>56 automated tests encoding physical invariants, fit accuracy and the reduction to the deterministic codal result</w:t>
             </w:r>
           </w:p>
         </w:tc>
@@ -3642,7 +3754,7 @@
                 <w:b/>
                 <w:sz w:val="18"/>
               </w:rPr>
-              <w:t>31 of 31 passing</w:t>
+              <w:t>56 of 56 passing</w:t>
             </w:r>
           </w:p>
         </w:tc>
@@ -3812,7 +3924,7 @@
                 <w:b/>
                 <w:sz w:val="18"/>
               </w:rPr>
-              <w:t>28 mm less than 320 mm case</w:t>
+              <w:t>15 mm less</w:t>
             </w:r>
           </w:p>
         </w:tc>
@@ -3865,10 +3977,10 @@
             <w:r/>
             <w:r>
               <w:rPr>
-                <w:b w:val="0"/>
+                <w:b/>
                 <w:sz w:val="18"/>
               </w:rPr>
-              <w:t>5 mm saving</w:t>
+              <w:t>5 mm less</w:t>
             </w:r>
           </w:p>
         </w:tc>
@@ -3924,7 +4036,7 @@
                 <w:b w:val="0"/>
                 <w:sz w:val="18"/>
               </w:rPr>
-              <w:t>no change</w:t>
+              <w:t>reference</w:t>
             </w:r>
           </w:p>
         </w:tc>
@@ -3977,10 +4089,10 @@
             <w:r/>
             <w:r>
               <w:rPr>
-                <w:b w:val="0"/>
+                <w:b/>
                 <w:sz w:val="18"/>
               </w:rPr>
-              <w:t>5 mm additional</w:t>
+              <w:t>5 mm more required</w:t>
             </w:r>
           </w:p>
         </w:tc>
@@ -4036,7 +4148,7 @@
                 <w:b/>
                 <w:sz w:val="18"/>
               </w:rPr>
-              <w:t>20 mm additional required</w:t>
+              <w:t>20 mm more required</w:t>
             </w:r>
           </w:p>
         </w:tc>
@@ -4084,6 +4196,301 @@
           <w:sz w:val="20"/>
         </w:rPr>
         <w:t>It is emphasised that these figures are illustrative and are produced with indicative coefficients of variation. Project-specific values derived from the client's own test records are to be substituted before any design application.</w:t>
+      </w:r>
+    </w:p>
+    <w:p>
+      <w:pPr>
+        <w:pStyle w:val="Heading3"/>
+      </w:pPr>
+      <w:r>
+        <w:t>8.2 Significance of thermal warping</w:t>
+      </w:r>
+    </w:p>
+    <w:p>
+      <w:pPr>
+        <w:jc w:val="both"/>
+      </w:pPr>
+      <w:r>
+        <w:rPr>
+          <w:b w:val="0"/>
+          <w:i w:val="0"/>
+        </w:rPr>
+        <w:t>The implemented thermal module demonstrates that warping stress frequently governs. For a 300 mm slab under a 15 tonne axle with a daytime temperature differential of 16.8 degrees Celsius:</w:t>
+      </w:r>
+    </w:p>
+    <w:tbl>
+      <w:tblPr>
+        <w:tblStyle w:val="TableGrid"/>
+        <w:tblW w:type="auto" w:w="0"/>
+        <w:jc w:val="center"/>
+        <w:tblLook w:firstColumn="1" w:firstRow="1" w:lastColumn="0" w:lastRow="0" w:noHBand="0" w:noVBand="1" w:val="04A0"/>
+      </w:tblPr>
+      <w:tblGrid>
+        <w:gridCol w:w="2268"/>
+        <w:gridCol w:w="2268"/>
+        <w:gridCol w:w="2268"/>
+        <w:gridCol w:w="2268"/>
+      </w:tblGrid>
+      <w:tr>
+        <w:tc>
+          <w:tcPr>
+            <w:tcW w:type="dxa" w:w="2948"/>
+            <w:shd w:val="clear" w:color="auto" w:fill="1F3B5C"/>
+          </w:tcPr>
+          <w:p>
+            <w:pPr>
+              <w:jc w:val="center"/>
+            </w:pPr>
+            <w:r/>
+            <w:r>
+              <w:rPr>
+                <w:b/>
+                <w:color w:val="FFFFFF"/>
+                <w:sz w:val="18"/>
+              </w:rPr>
+              <w:t>Analysis</w:t>
+            </w:r>
+          </w:p>
+        </w:tc>
+        <w:tc>
+          <w:tcPr>
+            <w:tcW w:type="dxa" w:w="1587"/>
+            <w:shd w:val="clear" w:color="auto" w:fill="1F3B5C"/>
+          </w:tcPr>
+          <w:p>
+            <w:pPr>
+              <w:jc w:val="center"/>
+            </w:pPr>
+            <w:r/>
+            <w:r>
+              <w:rPr>
+                <w:b/>
+                <w:color w:val="FFFFFF"/>
+                <w:sz w:val="18"/>
+              </w:rPr>
+              <w:t>Stress (MPa)</w:t>
+            </w:r>
+          </w:p>
+        </w:tc>
+        <w:tc>
+          <w:tcPr>
+            <w:tcW w:type="dxa" w:w="1587"/>
+            <w:shd w:val="clear" w:color="auto" w:fill="1F3B5C"/>
+          </w:tcPr>
+          <w:p>
+            <w:pPr>
+              <w:jc w:val="center"/>
+            </w:pPr>
+            <w:r/>
+            <w:r>
+              <w:rPr>
+                <w:b/>
+                <w:color w:val="FFFFFF"/>
+                <w:sz w:val="18"/>
+              </w:rPr>
+              <w:t>Stress ratio</w:t>
+            </w:r>
+          </w:p>
+        </w:tc>
+        <w:tc>
+          <w:tcPr>
+            <w:tcW w:type="dxa" w:w="2948"/>
+            <w:shd w:val="clear" w:color="auto" w:fill="1F3B5C"/>
+          </w:tcPr>
+          <w:p>
+            <w:pPr>
+              <w:jc w:val="center"/>
+            </w:pPr>
+            <w:r/>
+            <w:r>
+              <w:rPr>
+                <w:b/>
+                <w:color w:val="FFFFFF"/>
+                <w:sz w:val="18"/>
+              </w:rPr>
+              <w:t>Assessment</w:t>
+            </w:r>
+          </w:p>
+        </w:tc>
+      </w:tr>
+      <w:tr>
+        <w:tc>
+          <w:tcPr>
+            <w:tcW w:type="dxa" w:w="2948"/>
+          </w:tcPr>
+          <w:p>
+            <w:pPr>
+              <w:spacing w:after="40"/>
+            </w:pPr>
+            <w:r/>
+            <w:r>
+              <w:rPr>
+                <w:b w:val="0"/>
+                <w:sz w:val="18"/>
+              </w:rPr>
+              <w:t>Load only</w:t>
+            </w:r>
+          </w:p>
+        </w:tc>
+        <w:tc>
+          <w:tcPr>
+            <w:tcW w:type="dxa" w:w="1587"/>
+          </w:tcPr>
+          <w:p>
+            <w:pPr>
+              <w:spacing w:after="40"/>
+            </w:pPr>
+            <w:r/>
+            <w:r>
+              <w:rPr>
+                <w:b w:val="0"/>
+                <w:sz w:val="18"/>
+              </w:rPr>
+              <w:t>2.055</w:t>
+            </w:r>
+          </w:p>
+        </w:tc>
+        <w:tc>
+          <w:tcPr>
+            <w:tcW w:type="dxa" w:w="1587"/>
+          </w:tcPr>
+          <w:p>
+            <w:pPr>
+              <w:spacing w:after="40"/>
+            </w:pPr>
+            <w:r/>
+            <w:r>
+              <w:rPr>
+                <w:b w:val="0"/>
+                <w:sz w:val="18"/>
+              </w:rPr>
+              <w:t>0.457</w:t>
+            </w:r>
+          </w:p>
+        </w:tc>
+        <w:tc>
+          <w:tcPr>
+            <w:tcW w:type="dxa" w:w="2948"/>
+          </w:tcPr>
+          <w:p>
+            <w:pPr>
+              <w:spacing w:after="40"/>
+            </w:pPr>
+            <w:r/>
+            <w:r>
+              <w:rPr>
+                <w:b w:val="0"/>
+                <w:sz w:val="18"/>
+              </w:rPr>
+              <w:t>below the endurance limit; apparently safe</w:t>
+            </w:r>
+          </w:p>
+        </w:tc>
+      </w:tr>
+      <w:tr>
+        <w:tc>
+          <w:tcPr>
+            <w:tcW w:type="dxa" w:w="2948"/>
+          </w:tcPr>
+          <w:p>
+            <w:pPr>
+              <w:spacing w:after="40"/>
+            </w:pPr>
+            <w:r/>
+            <w:r>
+              <w:rPr>
+                <w:b w:val="0"/>
+                <w:sz w:val="18"/>
+              </w:rPr>
+              <w:t>Load and warping combined (BUC governs)</w:t>
+            </w:r>
+          </w:p>
+        </w:tc>
+        <w:tc>
+          <w:tcPr>
+            <w:tcW w:type="dxa" w:w="1587"/>
+          </w:tcPr>
+          <w:p>
+            <w:pPr>
+              <w:spacing w:after="40"/>
+            </w:pPr>
+            <w:r/>
+            <w:r>
+              <w:rPr>
+                <w:b w:val="0"/>
+                <w:sz w:val="18"/>
+              </w:rPr>
+              <w:t>3.625</w:t>
+            </w:r>
+          </w:p>
+        </w:tc>
+        <w:tc>
+          <w:tcPr>
+            <w:tcW w:type="dxa" w:w="1587"/>
+          </w:tcPr>
+          <w:p>
+            <w:pPr>
+              <w:spacing w:after="40"/>
+            </w:pPr>
+            <w:r/>
+            <w:r>
+              <w:rPr>
+                <w:b w:val="0"/>
+                <w:sz w:val="18"/>
+              </w:rPr>
+              <w:t>0.806</w:t>
+            </w:r>
+          </w:p>
+        </w:tc>
+        <w:tc>
+          <w:tcPr>
+            <w:tcW w:type="dxa" w:w="2948"/>
+          </w:tcPr>
+          <w:p>
+            <w:pPr>
+              <w:spacing w:after="40"/>
+            </w:pPr>
+            <w:r/>
+            <w:r>
+              <w:rPr>
+                <w:b/>
+                <w:sz w:val="18"/>
+              </w:rPr>
+              <w:t>substantially above the endurance limit</w:t>
+            </w:r>
+          </w:p>
+        </w:tc>
+      </w:tr>
+    </w:tbl>
+    <w:p>
+      <w:pPr>
+        <w:spacing w:after="80"/>
+      </w:pPr>
+    </w:p>
+    <w:p>
+      <w:pPr>
+        <w:spacing w:after="200"/>
+        <w:jc w:val="center"/>
+      </w:pPr>
+      <w:r>
+        <w:rPr>
+          <w:i/>
+          <w:color w:val="444444"/>
+          <w:sz w:val="18"/>
+        </w:rPr>
+        <w:t>Table 8.3 — Effect of thermal warping on the governing stress ratio.</w:t>
+      </w:r>
+    </w:p>
+    <w:p>
+      <w:pPr>
+        <w:jc w:val="both"/>
+      </w:pPr>
+      <w:r>
+        <w:rPr>
+          <w:b w:val="0"/>
+          <w:i w:val="0"/>
+        </w:rPr>
+        <w:t>Omitting thermal warping understates the stress ratio by approximately 43 per cent. Because the fatigue relationship is steeply non-linear in the stress ratio, this becomes an error of orders of magnitude in the allowable number of load repetitions. Warping is therefore not a refinement but is frequently the governing consideration.</w:t>
       </w:r>
     </w:p>
     <w:p>

</xml_diff>